<commit_message>
Fixed Vercel static routing and removed root server.js
</commit_message>
<xml_diff>
--- a/public/LINKS/EpiForms (2026)/Leptospirosis.docx
+++ b/public/LINKS/EpiForms (2026)/Leptospirosis.docx
@@ -4541,12 +4541,7 @@
         </w:tc>
       </w:tr>
     </w:tbl>
-    <w:p>
-      <w:r>
-        <w:lastRenderedPageBreak/>
-        <w:br w:type="page"/>
-      </w:r>
-    </w:p>
+    <w:p/>
     <w:tbl>
       <w:tblPr>
         <w:tblStyle w:val="TableGrid"/>
@@ -4591,7 +4586,6 @@
                 <w:sz w:val="15"/>
                 <w:szCs w:val="15"/>
               </w:rPr>
-              <w:lastRenderedPageBreak/>
               <w:t xml:space="preserve">Address of Workplace </w:t>
             </w:r>
             <w:r>
@@ -10052,6 +10046,7 @@
                 <w:sz w:val="15"/>
                 <w:szCs w:val="15"/>
               </w:rPr>
+              <w:lastRenderedPageBreak/>
               <w:t>If more than 5, write on the back</w:t>
             </w:r>
           </w:p>
@@ -10084,6 +10079,7 @@
                 <w:sz w:val="15"/>
                 <w:szCs w:val="15"/>
               </w:rPr>
+              <w:lastRenderedPageBreak/>
               <w:t>Health</w:t>
             </w:r>
             <w:r>
@@ -10280,7 +10276,6 @@
                 <w:sz w:val="15"/>
                 <w:szCs w:val="15"/>
               </w:rPr>
-              <w:lastRenderedPageBreak/>
               <w:t xml:space="preserve">If </w:t>
             </w:r>
             <w:r>
@@ -11657,14 +11652,25 @@
               </w:rPr>
               <w:t xml:space="preserve"> </w:t>
             </w:r>
-            <w:r>
-              <w:rPr>
-                <w:rFonts w:ascii="Tahoma" w:eastAsia="Tahoma" w:hAnsi="Tahoma" w:cs="Tahoma"/>
-                <w:color w:val="222A35"/>
-                <w:sz w:val="16"/>
-                <w:szCs w:val="16"/>
-              </w:rPr>
-              <w:t>Lepto-MAT</w:t>
+            <w:proofErr w:type="spellStart"/>
+            <w:r>
+              <w:rPr>
+                <w:rFonts w:ascii="Tahoma" w:eastAsia="Tahoma" w:hAnsi="Tahoma" w:cs="Tahoma"/>
+                <w:color w:val="222A35"/>
+                <w:sz w:val="16"/>
+                <w:szCs w:val="16"/>
+              </w:rPr>
+              <w:t>Lepto</w:t>
+            </w:r>
+            <w:proofErr w:type="spellEnd"/>
+            <w:r>
+              <w:rPr>
+                <w:rFonts w:ascii="Tahoma" w:eastAsia="Tahoma" w:hAnsi="Tahoma" w:cs="Tahoma"/>
+                <w:color w:val="222A35"/>
+                <w:sz w:val="16"/>
+                <w:szCs w:val="16"/>
+              </w:rPr>
+              <w:t>-MAT</w:t>
             </w:r>
           </w:p>
           <w:p>
@@ -13212,7 +13218,17 @@
                 <w:sz w:val="16"/>
                 <w:szCs w:val="16"/>
               </w:rPr>
-              <w:t xml:space="preserve"> h</w:t>
+              <w:t xml:space="preserve"> </w:t>
+            </w:r>
+            <w:proofErr w:type="spellStart"/>
+            <w:r>
+              <w:rPr>
+                <w:rFonts w:ascii="Tahoma" w:eastAsia="Tahoma" w:hAnsi="Tahoma" w:cs="Tahoma"/>
+                <w:color w:val="222A35"/>
+                <w:sz w:val="16"/>
+                <w:szCs w:val="16"/>
+              </w:rPr>
+              <w:t>h</w:t>
             </w:r>
             <w:r>
               <w:rPr>
@@ -13223,6 +13239,7 @@
               </w:rPr>
               <w:t>rs</w:t>
             </w:r>
+            <w:proofErr w:type="spellEnd"/>
             <w:r>
               <w:rPr>
                 <w:rFonts w:ascii="Tahoma" w:eastAsia="Tahoma" w:hAnsi="Tahoma" w:cs="Tahoma"/>
@@ -15230,7 +15247,31 @@
                 <w:sz w:val="16"/>
                 <w:szCs w:val="16"/>
               </w:rPr>
-              <w:t>(security guard, barangay tanod)</w:t>
+              <w:t xml:space="preserve">(security guard, barangay </w:t>
+            </w:r>
+            <w:proofErr w:type="spellStart"/>
+            <w:r>
+              <w:rPr>
+                <w:rFonts w:ascii="Tahoma" w:eastAsia="Tahoma" w:hAnsi="Tahoma" w:cs="Tahoma"/>
+                <w:i/>
+                <w:iCs/>
+                <w:color w:val="222A35"/>
+                <w:sz w:val="16"/>
+                <w:szCs w:val="16"/>
+              </w:rPr>
+              <w:t>tanod</w:t>
+            </w:r>
+            <w:proofErr w:type="spellEnd"/>
+            <w:r>
+              <w:rPr>
+                <w:rFonts w:ascii="Tahoma" w:eastAsia="Tahoma" w:hAnsi="Tahoma" w:cs="Tahoma"/>
+                <w:i/>
+                <w:iCs/>
+                <w:color w:val="222A35"/>
+                <w:sz w:val="16"/>
+                <w:szCs w:val="16"/>
+              </w:rPr>
+              <w:t>)</w:t>
             </w:r>
           </w:p>
         </w:tc>
@@ -15638,6 +15679,7 @@
                 <w:sz w:val="16"/>
                 <w:szCs w:val="16"/>
               </w:rPr>
+              <w:lastRenderedPageBreak/>
               <w:t xml:space="preserve">     </w:t>
             </w:r>
             <w:sdt>
@@ -15889,7 +15931,6 @@
                 <w:sz w:val="16"/>
                 <w:szCs w:val="16"/>
               </w:rPr>
-              <w:lastRenderedPageBreak/>
               <w:t>Most probable exposure:</w:t>
             </w:r>
           </w:p>
@@ -17354,8 +17395,19 @@
                 <w:sz w:val="16"/>
                 <w:szCs w:val="16"/>
               </w:rPr>
-              <w:t>Multi-storey</w:t>
-            </w:r>
+              <w:t>Multi-</w:t>
+            </w:r>
+            <w:proofErr w:type="spellStart"/>
+            <w:r>
+              <w:rPr>
+                <w:rFonts w:ascii="Tahoma" w:eastAsia="Tahoma" w:hAnsi="Tahoma" w:cs="Tahoma"/>
+                <w:color w:val="222A35"/>
+                <w:sz w:val="16"/>
+                <w:szCs w:val="16"/>
+              </w:rPr>
+              <w:t>storey</w:t>
+            </w:r>
+            <w:proofErr w:type="spellEnd"/>
             <w:proofErr w:type="gramEnd"/>
           </w:p>
           <w:p>
@@ -17838,7 +17890,31 @@
                 <w:sz w:val="16"/>
                 <w:szCs w:val="16"/>
               </w:rPr>
-              <w:t>(PreP)</w:t>
+              <w:t>(</w:t>
+            </w:r>
+            <w:proofErr w:type="spellStart"/>
+            <w:r>
+              <w:rPr>
+                <w:rFonts w:ascii="Tahoma" w:eastAsia="Tahoma" w:hAnsi="Tahoma" w:cs="Tahoma"/>
+                <w:b/>
+                <w:bCs/>
+                <w:color w:val="222A35"/>
+                <w:sz w:val="16"/>
+                <w:szCs w:val="16"/>
+              </w:rPr>
+              <w:t>PreP</w:t>
+            </w:r>
+            <w:proofErr w:type="spellEnd"/>
+            <w:r>
+              <w:rPr>
+                <w:rFonts w:ascii="Tahoma" w:eastAsia="Tahoma" w:hAnsi="Tahoma" w:cs="Tahoma"/>
+                <w:b/>
+                <w:bCs/>
+                <w:color w:val="222A35"/>
+                <w:sz w:val="16"/>
+                <w:szCs w:val="16"/>
+              </w:rPr>
+              <w:t>)</w:t>
             </w:r>
             <w:r>
               <w:rPr>
@@ -18481,7 +18557,6 @@
               </w:rPr>
               <w:t xml:space="preserve">If </w:t>
             </w:r>
-            <w:proofErr w:type="gramStart"/>
             <w:r>
               <w:rPr>
                 <w:rFonts w:ascii="Tahoma" w:eastAsia="Tahoma" w:hAnsi="Tahoma" w:cs="Tahoma"/>
@@ -18493,7 +18568,6 @@
               </w:rPr>
               <w:t>No</w:t>
             </w:r>
-            <w:proofErr w:type="gramEnd"/>
             <w:r>
               <w:rPr>
                 <w:rFonts w:ascii="Tahoma" w:eastAsia="Tahoma" w:hAnsi="Tahoma" w:cs="Tahoma"/>
@@ -21120,6 +21194,7 @@
                 <w:sz w:val="15"/>
                 <w:szCs w:val="15"/>
               </w:rPr>
+              <w:lastRenderedPageBreak/>
               <w:t xml:space="preserve">     </w:t>
             </w:r>
             <w:r>
@@ -21228,6 +21303,7 @@
                 <w:sz w:val="15"/>
                 <w:szCs w:val="15"/>
               </w:rPr>
+              <w:lastRenderedPageBreak/>
               <w:t xml:space="preserve">     </w:t>
             </w:r>
             <w:r>
@@ -21307,7 +21383,6 @@
                 <w:sz w:val="15"/>
                 <w:szCs w:val="15"/>
               </w:rPr>
-              <w:lastRenderedPageBreak/>
               <w:t xml:space="preserve">5. INTERVENTIONS AND CONTROL MEASURE </w:t>
             </w:r>
           </w:p>
@@ -24058,8 +24133,9 @@
                 <w:sz w:val="16"/>
                 <w:szCs w:val="16"/>
               </w:rPr>
-              <w:t xml:space="preserve">Alam mo ba kung ano ang </w:t>
-            </w:r>
+              <w:t xml:space="preserve">Alam </w:t>
+            </w:r>
+            <w:proofErr w:type="spellStart"/>
             <w:r>
               <w:rPr>
                 <w:rFonts w:ascii="Tahoma" w:hAnsi="Tahoma" w:cs="Tahoma"/>
@@ -24069,8 +24145,9 @@
                 <w:sz w:val="16"/>
                 <w:szCs w:val="16"/>
               </w:rPr>
-              <w:t>sakit na “</w:t>
-            </w:r>
+              <w:t>mo</w:t>
+            </w:r>
+            <w:proofErr w:type="spellEnd"/>
             <w:r>
               <w:rPr>
                 <w:rFonts w:ascii="Tahoma" w:hAnsi="Tahoma" w:cs="Tahoma"/>
@@ -24080,8 +24157,9 @@
                 <w:sz w:val="16"/>
                 <w:szCs w:val="16"/>
               </w:rPr>
-              <w:t>leptospirosis</w:t>
-            </w:r>
+              <w:t xml:space="preserve"> </w:t>
+            </w:r>
+            <w:proofErr w:type="spellStart"/>
             <w:r>
               <w:rPr>
                 <w:rFonts w:ascii="Tahoma" w:hAnsi="Tahoma" w:cs="Tahoma"/>
@@ -24091,8 +24169,9 @@
                 <w:sz w:val="16"/>
                 <w:szCs w:val="16"/>
               </w:rPr>
-              <w:t>”</w:t>
-            </w:r>
+              <w:t>ba</w:t>
+            </w:r>
+            <w:proofErr w:type="spellEnd"/>
             <w:r>
               <w:rPr>
                 <w:rFonts w:ascii="Tahoma" w:hAnsi="Tahoma" w:cs="Tahoma"/>
@@ -24102,7 +24181,160 @@
                 <w:sz w:val="16"/>
                 <w:szCs w:val="16"/>
               </w:rPr>
-              <w:t xml:space="preserve"> bago ka nagkasakit?</w:t>
+              <w:t xml:space="preserve"> kung </w:t>
+            </w:r>
+            <w:proofErr w:type="spellStart"/>
+            <w:r>
+              <w:rPr>
+                <w:rFonts w:ascii="Tahoma" w:hAnsi="Tahoma" w:cs="Tahoma"/>
+                <w:i/>
+                <w:iCs/>
+                <w:color w:val="000000" w:themeColor="text1"/>
+                <w:sz w:val="16"/>
+                <w:szCs w:val="16"/>
+              </w:rPr>
+              <w:t>ano</w:t>
+            </w:r>
+            <w:proofErr w:type="spellEnd"/>
+            <w:r>
+              <w:rPr>
+                <w:rFonts w:ascii="Tahoma" w:hAnsi="Tahoma" w:cs="Tahoma"/>
+                <w:i/>
+                <w:iCs/>
+                <w:color w:val="000000" w:themeColor="text1"/>
+                <w:sz w:val="16"/>
+                <w:szCs w:val="16"/>
+              </w:rPr>
+              <w:t xml:space="preserve"> ang </w:t>
+            </w:r>
+            <w:proofErr w:type="spellStart"/>
+            <w:r>
+              <w:rPr>
+                <w:rFonts w:ascii="Tahoma" w:hAnsi="Tahoma" w:cs="Tahoma"/>
+                <w:i/>
+                <w:iCs/>
+                <w:color w:val="000000" w:themeColor="text1"/>
+                <w:sz w:val="16"/>
+                <w:szCs w:val="16"/>
+              </w:rPr>
+              <w:t>sakit</w:t>
+            </w:r>
+            <w:proofErr w:type="spellEnd"/>
+            <w:r>
+              <w:rPr>
+                <w:rFonts w:ascii="Tahoma" w:hAnsi="Tahoma" w:cs="Tahoma"/>
+                <w:i/>
+                <w:iCs/>
+                <w:color w:val="000000" w:themeColor="text1"/>
+                <w:sz w:val="16"/>
+                <w:szCs w:val="16"/>
+              </w:rPr>
+              <w:t xml:space="preserve"> </w:t>
+            </w:r>
+            <w:proofErr w:type="spellStart"/>
+            <w:r>
+              <w:rPr>
+                <w:rFonts w:ascii="Tahoma" w:hAnsi="Tahoma" w:cs="Tahoma"/>
+                <w:i/>
+                <w:iCs/>
+                <w:color w:val="000000" w:themeColor="text1"/>
+                <w:sz w:val="16"/>
+                <w:szCs w:val="16"/>
+              </w:rPr>
+              <w:t>na</w:t>
+            </w:r>
+            <w:proofErr w:type="spellEnd"/>
+            <w:r>
+              <w:rPr>
+                <w:rFonts w:ascii="Tahoma" w:hAnsi="Tahoma" w:cs="Tahoma"/>
+                <w:i/>
+                <w:iCs/>
+                <w:color w:val="000000" w:themeColor="text1"/>
+                <w:sz w:val="16"/>
+                <w:szCs w:val="16"/>
+              </w:rPr>
+              <w:t xml:space="preserve"> “</w:t>
+            </w:r>
+            <w:r>
+              <w:rPr>
+                <w:rFonts w:ascii="Tahoma" w:hAnsi="Tahoma" w:cs="Tahoma"/>
+                <w:i/>
+                <w:iCs/>
+                <w:color w:val="000000" w:themeColor="text1"/>
+                <w:sz w:val="16"/>
+                <w:szCs w:val="16"/>
+              </w:rPr>
+              <w:t>leptospirosis</w:t>
+            </w:r>
+            <w:r>
+              <w:rPr>
+                <w:rFonts w:ascii="Tahoma" w:hAnsi="Tahoma" w:cs="Tahoma"/>
+                <w:i/>
+                <w:iCs/>
+                <w:color w:val="000000" w:themeColor="text1"/>
+                <w:sz w:val="16"/>
+                <w:szCs w:val="16"/>
+              </w:rPr>
+              <w:t>”</w:t>
+            </w:r>
+            <w:r>
+              <w:rPr>
+                <w:rFonts w:ascii="Tahoma" w:hAnsi="Tahoma" w:cs="Tahoma"/>
+                <w:i/>
+                <w:iCs/>
+                <w:color w:val="000000" w:themeColor="text1"/>
+                <w:sz w:val="16"/>
+                <w:szCs w:val="16"/>
+              </w:rPr>
+              <w:t xml:space="preserve"> </w:t>
+            </w:r>
+            <w:proofErr w:type="spellStart"/>
+            <w:r>
+              <w:rPr>
+                <w:rFonts w:ascii="Tahoma" w:hAnsi="Tahoma" w:cs="Tahoma"/>
+                <w:i/>
+                <w:iCs/>
+                <w:color w:val="000000" w:themeColor="text1"/>
+                <w:sz w:val="16"/>
+                <w:szCs w:val="16"/>
+              </w:rPr>
+              <w:t>bago</w:t>
+            </w:r>
+            <w:proofErr w:type="spellEnd"/>
+            <w:r>
+              <w:rPr>
+                <w:rFonts w:ascii="Tahoma" w:hAnsi="Tahoma" w:cs="Tahoma"/>
+                <w:i/>
+                <w:iCs/>
+                <w:color w:val="000000" w:themeColor="text1"/>
+                <w:sz w:val="16"/>
+                <w:szCs w:val="16"/>
+              </w:rPr>
+              <w:t xml:space="preserve"> ka </w:t>
+            </w:r>
+            <w:proofErr w:type="spellStart"/>
+            <w:r>
+              <w:rPr>
+                <w:rFonts w:ascii="Tahoma" w:hAnsi="Tahoma" w:cs="Tahoma"/>
+                <w:i/>
+                <w:iCs/>
+                <w:color w:val="000000" w:themeColor="text1"/>
+                <w:sz w:val="16"/>
+                <w:szCs w:val="16"/>
+              </w:rPr>
+              <w:t>nagkasakit</w:t>
+            </w:r>
+            <w:proofErr w:type="spellEnd"/>
+            <w:r>
+              <w:rPr>
+                <w:rFonts w:ascii="Tahoma" w:hAnsi="Tahoma" w:cs="Tahoma"/>
+                <w:i/>
+                <w:iCs/>
+                <w:color w:val="000000" w:themeColor="text1"/>
+                <w:sz w:val="16"/>
+                <w:szCs w:val="16"/>
+              </w:rPr>
+              <w:t>?</w:t>
             </w:r>
             <w:r>
               <w:rPr>
@@ -24232,7 +24464,247 @@
                 <w:sz w:val="16"/>
                 <w:szCs w:val="16"/>
               </w:rPr>
-              <w:t>Alam mo ba na puwedeng makuha ang leptospirosis mula sa pagsulong sa baha?</w:t>
+              <w:t xml:space="preserve">Alam </w:t>
+            </w:r>
+            <w:proofErr w:type="spellStart"/>
+            <w:r>
+              <w:rPr>
+                <w:rFonts w:ascii="Tahoma" w:eastAsia="Tahoma" w:hAnsi="Tahoma" w:cs="Tahoma"/>
+                <w:i/>
+                <w:iCs/>
+                <w:color w:val="000000" w:themeColor="text1"/>
+                <w:sz w:val="16"/>
+                <w:szCs w:val="16"/>
+              </w:rPr>
+              <w:t>mo</w:t>
+            </w:r>
+            <w:proofErr w:type="spellEnd"/>
+            <w:r>
+              <w:rPr>
+                <w:rFonts w:ascii="Tahoma" w:eastAsia="Tahoma" w:hAnsi="Tahoma" w:cs="Tahoma"/>
+                <w:i/>
+                <w:iCs/>
+                <w:color w:val="000000" w:themeColor="text1"/>
+                <w:sz w:val="16"/>
+                <w:szCs w:val="16"/>
+              </w:rPr>
+              <w:t xml:space="preserve"> </w:t>
+            </w:r>
+            <w:proofErr w:type="spellStart"/>
+            <w:r>
+              <w:rPr>
+                <w:rFonts w:ascii="Tahoma" w:eastAsia="Tahoma" w:hAnsi="Tahoma" w:cs="Tahoma"/>
+                <w:i/>
+                <w:iCs/>
+                <w:color w:val="000000" w:themeColor="text1"/>
+                <w:sz w:val="16"/>
+                <w:szCs w:val="16"/>
+              </w:rPr>
+              <w:t>ba</w:t>
+            </w:r>
+            <w:proofErr w:type="spellEnd"/>
+            <w:r>
+              <w:rPr>
+                <w:rFonts w:ascii="Tahoma" w:eastAsia="Tahoma" w:hAnsi="Tahoma" w:cs="Tahoma"/>
+                <w:i/>
+                <w:iCs/>
+                <w:color w:val="000000" w:themeColor="text1"/>
+                <w:sz w:val="16"/>
+                <w:szCs w:val="16"/>
+              </w:rPr>
+              <w:t xml:space="preserve"> </w:t>
+            </w:r>
+            <w:proofErr w:type="spellStart"/>
+            <w:r>
+              <w:rPr>
+                <w:rFonts w:ascii="Tahoma" w:eastAsia="Tahoma" w:hAnsi="Tahoma" w:cs="Tahoma"/>
+                <w:i/>
+                <w:iCs/>
+                <w:color w:val="000000" w:themeColor="text1"/>
+                <w:sz w:val="16"/>
+                <w:szCs w:val="16"/>
+              </w:rPr>
+              <w:t>na</w:t>
+            </w:r>
+            <w:proofErr w:type="spellEnd"/>
+            <w:r>
+              <w:rPr>
+                <w:rFonts w:ascii="Tahoma" w:eastAsia="Tahoma" w:hAnsi="Tahoma" w:cs="Tahoma"/>
+                <w:i/>
+                <w:iCs/>
+                <w:color w:val="000000" w:themeColor="text1"/>
+                <w:sz w:val="16"/>
+                <w:szCs w:val="16"/>
+              </w:rPr>
+              <w:t xml:space="preserve"> </w:t>
+            </w:r>
+            <w:proofErr w:type="spellStart"/>
+            <w:r>
+              <w:rPr>
+                <w:rFonts w:ascii="Tahoma" w:eastAsia="Tahoma" w:hAnsi="Tahoma" w:cs="Tahoma"/>
+                <w:i/>
+                <w:iCs/>
+                <w:color w:val="000000" w:themeColor="text1"/>
+                <w:sz w:val="16"/>
+                <w:szCs w:val="16"/>
+              </w:rPr>
+              <w:t>puwedeng</w:t>
+            </w:r>
+            <w:proofErr w:type="spellEnd"/>
+            <w:r>
+              <w:rPr>
+                <w:rFonts w:ascii="Tahoma" w:eastAsia="Tahoma" w:hAnsi="Tahoma" w:cs="Tahoma"/>
+                <w:i/>
+                <w:iCs/>
+                <w:color w:val="000000" w:themeColor="text1"/>
+                <w:sz w:val="16"/>
+                <w:szCs w:val="16"/>
+              </w:rPr>
+              <w:t xml:space="preserve"> </w:t>
+            </w:r>
+            <w:proofErr w:type="spellStart"/>
+            <w:r>
+              <w:rPr>
+                <w:rFonts w:ascii="Tahoma" w:eastAsia="Tahoma" w:hAnsi="Tahoma" w:cs="Tahoma"/>
+                <w:i/>
+                <w:iCs/>
+                <w:color w:val="000000" w:themeColor="text1"/>
+                <w:sz w:val="16"/>
+                <w:szCs w:val="16"/>
+              </w:rPr>
+              <w:t>makuha</w:t>
+            </w:r>
+            <w:proofErr w:type="spellEnd"/>
+            <w:r>
+              <w:rPr>
+                <w:rFonts w:ascii="Tahoma" w:eastAsia="Tahoma" w:hAnsi="Tahoma" w:cs="Tahoma"/>
+                <w:i/>
+                <w:iCs/>
+                <w:color w:val="000000" w:themeColor="text1"/>
+                <w:sz w:val="16"/>
+                <w:szCs w:val="16"/>
+              </w:rPr>
+              <w:t xml:space="preserve"> ang leptospirosis </w:t>
+            </w:r>
+            <w:proofErr w:type="spellStart"/>
+            <w:r>
+              <w:rPr>
+                <w:rFonts w:ascii="Tahoma" w:eastAsia="Tahoma" w:hAnsi="Tahoma" w:cs="Tahoma"/>
+                <w:i/>
+                <w:iCs/>
+                <w:color w:val="000000" w:themeColor="text1"/>
+                <w:sz w:val="16"/>
+                <w:szCs w:val="16"/>
+              </w:rPr>
+              <w:t>mula</w:t>
+            </w:r>
+            <w:proofErr w:type="spellEnd"/>
+            <w:r>
+              <w:rPr>
+                <w:rFonts w:ascii="Tahoma" w:eastAsia="Tahoma" w:hAnsi="Tahoma" w:cs="Tahoma"/>
+                <w:i/>
+                <w:iCs/>
+                <w:color w:val="000000" w:themeColor="text1"/>
+                <w:sz w:val="16"/>
+                <w:szCs w:val="16"/>
+              </w:rPr>
+              <w:t xml:space="preserve"> </w:t>
+            </w:r>
+            <w:proofErr w:type="spellStart"/>
+            <w:r>
+              <w:rPr>
+                <w:rFonts w:ascii="Tahoma" w:eastAsia="Tahoma" w:hAnsi="Tahoma" w:cs="Tahoma"/>
+                <w:i/>
+                <w:iCs/>
+                <w:color w:val="000000" w:themeColor="text1"/>
+                <w:sz w:val="16"/>
+                <w:szCs w:val="16"/>
+              </w:rPr>
+              <w:t>sa</w:t>
+            </w:r>
+            <w:proofErr w:type="spellEnd"/>
+            <w:r>
+              <w:rPr>
+                <w:rFonts w:ascii="Tahoma" w:eastAsia="Tahoma" w:hAnsi="Tahoma" w:cs="Tahoma"/>
+                <w:i/>
+                <w:iCs/>
+                <w:color w:val="000000" w:themeColor="text1"/>
+                <w:sz w:val="16"/>
+                <w:szCs w:val="16"/>
+              </w:rPr>
+              <w:t xml:space="preserve"> </w:t>
+            </w:r>
+            <w:proofErr w:type="spellStart"/>
+            <w:r>
+              <w:rPr>
+                <w:rFonts w:ascii="Tahoma" w:eastAsia="Tahoma" w:hAnsi="Tahoma" w:cs="Tahoma"/>
+                <w:i/>
+                <w:iCs/>
+                <w:color w:val="000000" w:themeColor="text1"/>
+                <w:sz w:val="16"/>
+                <w:szCs w:val="16"/>
+              </w:rPr>
+              <w:t>pagsulong</w:t>
+            </w:r>
+            <w:proofErr w:type="spellEnd"/>
+            <w:r>
+              <w:rPr>
+                <w:rFonts w:ascii="Tahoma" w:eastAsia="Tahoma" w:hAnsi="Tahoma" w:cs="Tahoma"/>
+                <w:i/>
+                <w:iCs/>
+                <w:color w:val="000000" w:themeColor="text1"/>
+                <w:sz w:val="16"/>
+                <w:szCs w:val="16"/>
+              </w:rPr>
+              <w:t xml:space="preserve"> </w:t>
+            </w:r>
+            <w:proofErr w:type="spellStart"/>
+            <w:r>
+              <w:rPr>
+                <w:rFonts w:ascii="Tahoma" w:eastAsia="Tahoma" w:hAnsi="Tahoma" w:cs="Tahoma"/>
+                <w:i/>
+                <w:iCs/>
+                <w:color w:val="000000" w:themeColor="text1"/>
+                <w:sz w:val="16"/>
+                <w:szCs w:val="16"/>
+              </w:rPr>
+              <w:t>sa</w:t>
+            </w:r>
+            <w:proofErr w:type="spellEnd"/>
+            <w:r>
+              <w:rPr>
+                <w:rFonts w:ascii="Tahoma" w:eastAsia="Tahoma" w:hAnsi="Tahoma" w:cs="Tahoma"/>
+                <w:i/>
+                <w:iCs/>
+                <w:color w:val="000000" w:themeColor="text1"/>
+                <w:sz w:val="16"/>
+                <w:szCs w:val="16"/>
+              </w:rPr>
+              <w:t xml:space="preserve"> </w:t>
+            </w:r>
+            <w:proofErr w:type="spellStart"/>
+            <w:r>
+              <w:rPr>
+                <w:rFonts w:ascii="Tahoma" w:eastAsia="Tahoma" w:hAnsi="Tahoma" w:cs="Tahoma"/>
+                <w:i/>
+                <w:iCs/>
+                <w:color w:val="000000" w:themeColor="text1"/>
+                <w:sz w:val="16"/>
+                <w:szCs w:val="16"/>
+              </w:rPr>
+              <w:t>baha</w:t>
+            </w:r>
+            <w:proofErr w:type="spellEnd"/>
+            <w:r>
+              <w:rPr>
+                <w:rFonts w:ascii="Tahoma" w:eastAsia="Tahoma" w:hAnsi="Tahoma" w:cs="Tahoma"/>
+                <w:i/>
+                <w:iCs/>
+                <w:color w:val="000000" w:themeColor="text1"/>
+                <w:sz w:val="16"/>
+                <w:szCs w:val="16"/>
+              </w:rPr>
+              <w:t>?</w:t>
             </w:r>
             <w:r>
               <w:rPr>
@@ -24349,7 +24821,199 @@
                 <w:sz w:val="16"/>
                 <w:szCs w:val="16"/>
               </w:rPr>
-              <w:t>Kung na-expose ka, sa tingin mo gaano kaaga lalabas ang sintomas?"</w:t>
+              <w:t xml:space="preserve">Kung </w:t>
+            </w:r>
+            <w:proofErr w:type="spellStart"/>
+            <w:r>
+              <w:rPr>
+                <w:rFonts w:ascii="Tahoma" w:hAnsi="Tahoma" w:cs="Tahoma"/>
+                <w:i/>
+                <w:iCs/>
+                <w:color w:val="000000" w:themeColor="text1"/>
+                <w:sz w:val="16"/>
+                <w:szCs w:val="16"/>
+              </w:rPr>
+              <w:t>na</w:t>
+            </w:r>
+            <w:proofErr w:type="spellEnd"/>
+            <w:r>
+              <w:rPr>
+                <w:rFonts w:ascii="Tahoma" w:hAnsi="Tahoma" w:cs="Tahoma"/>
+                <w:i/>
+                <w:iCs/>
+                <w:color w:val="000000" w:themeColor="text1"/>
+                <w:sz w:val="16"/>
+                <w:szCs w:val="16"/>
+              </w:rPr>
+              <w:t xml:space="preserve">-expose ka, </w:t>
+            </w:r>
+            <w:proofErr w:type="spellStart"/>
+            <w:r>
+              <w:rPr>
+                <w:rFonts w:ascii="Tahoma" w:hAnsi="Tahoma" w:cs="Tahoma"/>
+                <w:i/>
+                <w:iCs/>
+                <w:color w:val="000000" w:themeColor="text1"/>
+                <w:sz w:val="16"/>
+                <w:szCs w:val="16"/>
+              </w:rPr>
+              <w:t>sa</w:t>
+            </w:r>
+            <w:proofErr w:type="spellEnd"/>
+            <w:r>
+              <w:rPr>
+                <w:rFonts w:ascii="Tahoma" w:hAnsi="Tahoma" w:cs="Tahoma"/>
+                <w:i/>
+                <w:iCs/>
+                <w:color w:val="000000" w:themeColor="text1"/>
+                <w:sz w:val="16"/>
+                <w:szCs w:val="16"/>
+              </w:rPr>
+              <w:t xml:space="preserve"> </w:t>
+            </w:r>
+            <w:proofErr w:type="spellStart"/>
+            <w:r>
+              <w:rPr>
+                <w:rFonts w:ascii="Tahoma" w:hAnsi="Tahoma" w:cs="Tahoma"/>
+                <w:i/>
+                <w:iCs/>
+                <w:color w:val="000000" w:themeColor="text1"/>
+                <w:sz w:val="16"/>
+                <w:szCs w:val="16"/>
+              </w:rPr>
+              <w:t>tingin</w:t>
+            </w:r>
+            <w:proofErr w:type="spellEnd"/>
+            <w:r>
+              <w:rPr>
+                <w:rFonts w:ascii="Tahoma" w:hAnsi="Tahoma" w:cs="Tahoma"/>
+                <w:i/>
+                <w:iCs/>
+                <w:color w:val="000000" w:themeColor="text1"/>
+                <w:sz w:val="16"/>
+                <w:szCs w:val="16"/>
+              </w:rPr>
+              <w:t xml:space="preserve"> </w:t>
+            </w:r>
+            <w:proofErr w:type="spellStart"/>
+            <w:r>
+              <w:rPr>
+                <w:rFonts w:ascii="Tahoma" w:hAnsi="Tahoma" w:cs="Tahoma"/>
+                <w:i/>
+                <w:iCs/>
+                <w:color w:val="000000" w:themeColor="text1"/>
+                <w:sz w:val="16"/>
+                <w:szCs w:val="16"/>
+              </w:rPr>
+              <w:t>mo</w:t>
+            </w:r>
+            <w:proofErr w:type="spellEnd"/>
+            <w:r>
+              <w:rPr>
+                <w:rFonts w:ascii="Tahoma" w:hAnsi="Tahoma" w:cs="Tahoma"/>
+                <w:i/>
+                <w:iCs/>
+                <w:color w:val="000000" w:themeColor="text1"/>
+                <w:sz w:val="16"/>
+                <w:szCs w:val="16"/>
+              </w:rPr>
+              <w:t xml:space="preserve"> </w:t>
+            </w:r>
+            <w:proofErr w:type="spellStart"/>
+            <w:r>
+              <w:rPr>
+                <w:rFonts w:ascii="Tahoma" w:hAnsi="Tahoma" w:cs="Tahoma"/>
+                <w:i/>
+                <w:iCs/>
+                <w:color w:val="000000" w:themeColor="text1"/>
+                <w:sz w:val="16"/>
+                <w:szCs w:val="16"/>
+              </w:rPr>
+              <w:t>gaano</w:t>
+            </w:r>
+            <w:proofErr w:type="spellEnd"/>
+            <w:r>
+              <w:rPr>
+                <w:rFonts w:ascii="Tahoma" w:hAnsi="Tahoma" w:cs="Tahoma"/>
+                <w:i/>
+                <w:iCs/>
+                <w:color w:val="000000" w:themeColor="text1"/>
+                <w:sz w:val="16"/>
+                <w:szCs w:val="16"/>
+              </w:rPr>
+              <w:t xml:space="preserve"> </w:t>
+            </w:r>
+            <w:proofErr w:type="spellStart"/>
+            <w:r>
+              <w:rPr>
+                <w:rFonts w:ascii="Tahoma" w:hAnsi="Tahoma" w:cs="Tahoma"/>
+                <w:i/>
+                <w:iCs/>
+                <w:color w:val="000000" w:themeColor="text1"/>
+                <w:sz w:val="16"/>
+                <w:szCs w:val="16"/>
+              </w:rPr>
+              <w:t>kaaga</w:t>
+            </w:r>
+            <w:proofErr w:type="spellEnd"/>
+            <w:r>
+              <w:rPr>
+                <w:rFonts w:ascii="Tahoma" w:hAnsi="Tahoma" w:cs="Tahoma"/>
+                <w:i/>
+                <w:iCs/>
+                <w:color w:val="000000" w:themeColor="text1"/>
+                <w:sz w:val="16"/>
+                <w:szCs w:val="16"/>
+              </w:rPr>
+              <w:t xml:space="preserve"> </w:t>
+            </w:r>
+            <w:proofErr w:type="spellStart"/>
+            <w:r>
+              <w:rPr>
+                <w:rFonts w:ascii="Tahoma" w:hAnsi="Tahoma" w:cs="Tahoma"/>
+                <w:i/>
+                <w:iCs/>
+                <w:color w:val="000000" w:themeColor="text1"/>
+                <w:sz w:val="16"/>
+                <w:szCs w:val="16"/>
+              </w:rPr>
+              <w:t>lalabas</w:t>
+            </w:r>
+            <w:proofErr w:type="spellEnd"/>
+            <w:r>
+              <w:rPr>
+                <w:rFonts w:ascii="Tahoma" w:hAnsi="Tahoma" w:cs="Tahoma"/>
+                <w:i/>
+                <w:iCs/>
+                <w:color w:val="000000" w:themeColor="text1"/>
+                <w:sz w:val="16"/>
+                <w:szCs w:val="16"/>
+              </w:rPr>
+              <w:t xml:space="preserve"> ang </w:t>
+            </w:r>
+            <w:proofErr w:type="spellStart"/>
+            <w:r>
+              <w:rPr>
+                <w:rFonts w:ascii="Tahoma" w:hAnsi="Tahoma" w:cs="Tahoma"/>
+                <w:i/>
+                <w:iCs/>
+                <w:color w:val="000000" w:themeColor="text1"/>
+                <w:sz w:val="16"/>
+                <w:szCs w:val="16"/>
+              </w:rPr>
+              <w:t>sintomas</w:t>
+            </w:r>
+            <w:proofErr w:type="spellEnd"/>
+            <w:r>
+              <w:rPr>
+                <w:rFonts w:ascii="Tahoma" w:hAnsi="Tahoma" w:cs="Tahoma"/>
+                <w:i/>
+                <w:iCs/>
+                <w:color w:val="000000" w:themeColor="text1"/>
+                <w:sz w:val="16"/>
+                <w:szCs w:val="16"/>
+              </w:rPr>
+              <w:t>?"</w:t>
             </w:r>
             <w:r>
               <w:rPr>
@@ -24549,8 +25213,9 @@
                 <w:sz w:val="16"/>
                 <w:szCs w:val="16"/>
               </w:rPr>
-              <w:t xml:space="preserve">Bago ka nagkasakit, alam mo ba kung gaano katagal </w:t>
-            </w:r>
+              <w:t xml:space="preserve">Bago ka </w:t>
+            </w:r>
+            <w:proofErr w:type="spellStart"/>
             <w:r>
               <w:rPr>
                 <w:rFonts w:ascii="Tahoma" w:eastAsia="Tahoma" w:hAnsi="Tahoma" w:cs="Tahoma"/>
@@ -24560,8 +25225,9 @@
                 <w:sz w:val="16"/>
                 <w:szCs w:val="16"/>
               </w:rPr>
-              <w:t xml:space="preserve">(ka-late) </w:t>
-            </w:r>
+              <w:t>nagkasakit</w:t>
+            </w:r>
+            <w:proofErr w:type="spellEnd"/>
             <w:r>
               <w:rPr>
                 <w:rFonts w:ascii="Tahoma" w:eastAsia="Tahoma" w:hAnsi="Tahoma" w:cs="Tahoma"/>
@@ -24571,7 +25237,210 @@
                 <w:sz w:val="16"/>
                 <w:szCs w:val="16"/>
               </w:rPr>
-              <w:t xml:space="preserve">bago lumabas ang sintomas? </w:t>
+              <w:t xml:space="preserve">, </w:t>
+            </w:r>
+            <w:proofErr w:type="spellStart"/>
+            <w:r>
+              <w:rPr>
+                <w:rFonts w:ascii="Tahoma" w:eastAsia="Tahoma" w:hAnsi="Tahoma" w:cs="Tahoma"/>
+                <w:i/>
+                <w:iCs/>
+                <w:color w:val="000000" w:themeColor="text1"/>
+                <w:sz w:val="16"/>
+                <w:szCs w:val="16"/>
+              </w:rPr>
+              <w:t>alam</w:t>
+            </w:r>
+            <w:proofErr w:type="spellEnd"/>
+            <w:r>
+              <w:rPr>
+                <w:rFonts w:ascii="Tahoma" w:eastAsia="Tahoma" w:hAnsi="Tahoma" w:cs="Tahoma"/>
+                <w:i/>
+                <w:iCs/>
+                <w:color w:val="000000" w:themeColor="text1"/>
+                <w:sz w:val="16"/>
+                <w:szCs w:val="16"/>
+              </w:rPr>
+              <w:t xml:space="preserve"> </w:t>
+            </w:r>
+            <w:proofErr w:type="spellStart"/>
+            <w:r>
+              <w:rPr>
+                <w:rFonts w:ascii="Tahoma" w:eastAsia="Tahoma" w:hAnsi="Tahoma" w:cs="Tahoma"/>
+                <w:i/>
+                <w:iCs/>
+                <w:color w:val="000000" w:themeColor="text1"/>
+                <w:sz w:val="16"/>
+                <w:szCs w:val="16"/>
+              </w:rPr>
+              <w:t>mo</w:t>
+            </w:r>
+            <w:proofErr w:type="spellEnd"/>
+            <w:r>
+              <w:rPr>
+                <w:rFonts w:ascii="Tahoma" w:eastAsia="Tahoma" w:hAnsi="Tahoma" w:cs="Tahoma"/>
+                <w:i/>
+                <w:iCs/>
+                <w:color w:val="000000" w:themeColor="text1"/>
+                <w:sz w:val="16"/>
+                <w:szCs w:val="16"/>
+              </w:rPr>
+              <w:t xml:space="preserve"> </w:t>
+            </w:r>
+            <w:proofErr w:type="spellStart"/>
+            <w:r>
+              <w:rPr>
+                <w:rFonts w:ascii="Tahoma" w:eastAsia="Tahoma" w:hAnsi="Tahoma" w:cs="Tahoma"/>
+                <w:i/>
+                <w:iCs/>
+                <w:color w:val="000000" w:themeColor="text1"/>
+                <w:sz w:val="16"/>
+                <w:szCs w:val="16"/>
+              </w:rPr>
+              <w:t>ba</w:t>
+            </w:r>
+            <w:proofErr w:type="spellEnd"/>
+            <w:r>
+              <w:rPr>
+                <w:rFonts w:ascii="Tahoma" w:eastAsia="Tahoma" w:hAnsi="Tahoma" w:cs="Tahoma"/>
+                <w:i/>
+                <w:iCs/>
+                <w:color w:val="000000" w:themeColor="text1"/>
+                <w:sz w:val="16"/>
+                <w:szCs w:val="16"/>
+              </w:rPr>
+              <w:t xml:space="preserve"> kung </w:t>
+            </w:r>
+            <w:proofErr w:type="spellStart"/>
+            <w:r>
+              <w:rPr>
+                <w:rFonts w:ascii="Tahoma" w:eastAsia="Tahoma" w:hAnsi="Tahoma" w:cs="Tahoma"/>
+                <w:i/>
+                <w:iCs/>
+                <w:color w:val="000000" w:themeColor="text1"/>
+                <w:sz w:val="16"/>
+                <w:szCs w:val="16"/>
+              </w:rPr>
+              <w:t>gaano</w:t>
+            </w:r>
+            <w:proofErr w:type="spellEnd"/>
+            <w:r>
+              <w:rPr>
+                <w:rFonts w:ascii="Tahoma" w:eastAsia="Tahoma" w:hAnsi="Tahoma" w:cs="Tahoma"/>
+                <w:i/>
+                <w:iCs/>
+                <w:color w:val="000000" w:themeColor="text1"/>
+                <w:sz w:val="16"/>
+                <w:szCs w:val="16"/>
+              </w:rPr>
+              <w:t xml:space="preserve"> </w:t>
+            </w:r>
+            <w:proofErr w:type="spellStart"/>
+            <w:r>
+              <w:rPr>
+                <w:rFonts w:ascii="Tahoma" w:eastAsia="Tahoma" w:hAnsi="Tahoma" w:cs="Tahoma"/>
+                <w:i/>
+                <w:iCs/>
+                <w:color w:val="000000" w:themeColor="text1"/>
+                <w:sz w:val="16"/>
+                <w:szCs w:val="16"/>
+              </w:rPr>
+              <w:t>katagal</w:t>
+            </w:r>
+            <w:proofErr w:type="spellEnd"/>
+            <w:r>
+              <w:rPr>
+                <w:rFonts w:ascii="Tahoma" w:eastAsia="Tahoma" w:hAnsi="Tahoma" w:cs="Tahoma"/>
+                <w:i/>
+                <w:iCs/>
+                <w:color w:val="000000" w:themeColor="text1"/>
+                <w:sz w:val="16"/>
+                <w:szCs w:val="16"/>
+              </w:rPr>
+              <w:t xml:space="preserve"> </w:t>
+            </w:r>
+            <w:r>
+              <w:rPr>
+                <w:rFonts w:ascii="Tahoma" w:eastAsia="Tahoma" w:hAnsi="Tahoma" w:cs="Tahoma"/>
+                <w:i/>
+                <w:iCs/>
+                <w:color w:val="000000" w:themeColor="text1"/>
+                <w:sz w:val="16"/>
+                <w:szCs w:val="16"/>
+              </w:rPr>
+              <w:t xml:space="preserve">(ka-late) </w:t>
+            </w:r>
+            <w:proofErr w:type="spellStart"/>
+            <w:r>
+              <w:rPr>
+                <w:rFonts w:ascii="Tahoma" w:eastAsia="Tahoma" w:hAnsi="Tahoma" w:cs="Tahoma"/>
+                <w:i/>
+                <w:iCs/>
+                <w:color w:val="000000" w:themeColor="text1"/>
+                <w:sz w:val="16"/>
+                <w:szCs w:val="16"/>
+              </w:rPr>
+              <w:t>bago</w:t>
+            </w:r>
+            <w:proofErr w:type="spellEnd"/>
+            <w:r>
+              <w:rPr>
+                <w:rFonts w:ascii="Tahoma" w:eastAsia="Tahoma" w:hAnsi="Tahoma" w:cs="Tahoma"/>
+                <w:i/>
+                <w:iCs/>
+                <w:color w:val="000000" w:themeColor="text1"/>
+                <w:sz w:val="16"/>
+                <w:szCs w:val="16"/>
+              </w:rPr>
+              <w:t xml:space="preserve"> </w:t>
+            </w:r>
+            <w:proofErr w:type="spellStart"/>
+            <w:r>
+              <w:rPr>
+                <w:rFonts w:ascii="Tahoma" w:eastAsia="Tahoma" w:hAnsi="Tahoma" w:cs="Tahoma"/>
+                <w:i/>
+                <w:iCs/>
+                <w:color w:val="000000" w:themeColor="text1"/>
+                <w:sz w:val="16"/>
+                <w:szCs w:val="16"/>
+              </w:rPr>
+              <w:t>lumabas</w:t>
+            </w:r>
+            <w:proofErr w:type="spellEnd"/>
+            <w:r>
+              <w:rPr>
+                <w:rFonts w:ascii="Tahoma" w:eastAsia="Tahoma" w:hAnsi="Tahoma" w:cs="Tahoma"/>
+                <w:i/>
+                <w:iCs/>
+                <w:color w:val="000000" w:themeColor="text1"/>
+                <w:sz w:val="16"/>
+                <w:szCs w:val="16"/>
+              </w:rPr>
+              <w:t xml:space="preserve"> ang </w:t>
+            </w:r>
+            <w:proofErr w:type="spellStart"/>
+            <w:r>
+              <w:rPr>
+                <w:rFonts w:ascii="Tahoma" w:eastAsia="Tahoma" w:hAnsi="Tahoma" w:cs="Tahoma"/>
+                <w:i/>
+                <w:iCs/>
+                <w:color w:val="000000" w:themeColor="text1"/>
+                <w:sz w:val="16"/>
+                <w:szCs w:val="16"/>
+              </w:rPr>
+              <w:t>sintomas</w:t>
+            </w:r>
+            <w:proofErr w:type="spellEnd"/>
+            <w:r>
+              <w:rPr>
+                <w:rFonts w:ascii="Tahoma" w:eastAsia="Tahoma" w:hAnsi="Tahoma" w:cs="Tahoma"/>
+                <w:i/>
+                <w:iCs/>
+                <w:color w:val="000000" w:themeColor="text1"/>
+                <w:sz w:val="16"/>
+                <w:szCs w:val="16"/>
+              </w:rPr>
+              <w:t xml:space="preserve">? </w:t>
             </w:r>
             <w:r>
               <w:rPr>
@@ -24751,7 +25620,103 @@
                 <w:sz w:val="16"/>
                 <w:szCs w:val="16"/>
               </w:rPr>
-              <w:t xml:space="preserve">Alam mo ba na may libreng prophylaxis? </w:t>
+              <w:t xml:space="preserve">Alam </w:t>
+            </w:r>
+            <w:proofErr w:type="spellStart"/>
+            <w:r>
+              <w:rPr>
+                <w:rFonts w:ascii="Tahoma" w:hAnsi="Tahoma" w:cs="Tahoma"/>
+                <w:i/>
+                <w:iCs/>
+                <w:color w:val="000000" w:themeColor="text1"/>
+                <w:sz w:val="16"/>
+                <w:szCs w:val="16"/>
+              </w:rPr>
+              <w:t>mo</w:t>
+            </w:r>
+            <w:proofErr w:type="spellEnd"/>
+            <w:r>
+              <w:rPr>
+                <w:rFonts w:ascii="Tahoma" w:hAnsi="Tahoma" w:cs="Tahoma"/>
+                <w:i/>
+                <w:iCs/>
+                <w:color w:val="000000" w:themeColor="text1"/>
+                <w:sz w:val="16"/>
+                <w:szCs w:val="16"/>
+              </w:rPr>
+              <w:t xml:space="preserve"> </w:t>
+            </w:r>
+            <w:proofErr w:type="spellStart"/>
+            <w:r>
+              <w:rPr>
+                <w:rFonts w:ascii="Tahoma" w:hAnsi="Tahoma" w:cs="Tahoma"/>
+                <w:i/>
+                <w:iCs/>
+                <w:color w:val="000000" w:themeColor="text1"/>
+                <w:sz w:val="16"/>
+                <w:szCs w:val="16"/>
+              </w:rPr>
+              <w:t>ba</w:t>
+            </w:r>
+            <w:proofErr w:type="spellEnd"/>
+            <w:r>
+              <w:rPr>
+                <w:rFonts w:ascii="Tahoma" w:hAnsi="Tahoma" w:cs="Tahoma"/>
+                <w:i/>
+                <w:iCs/>
+                <w:color w:val="000000" w:themeColor="text1"/>
+                <w:sz w:val="16"/>
+                <w:szCs w:val="16"/>
+              </w:rPr>
+              <w:t xml:space="preserve"> </w:t>
+            </w:r>
+            <w:proofErr w:type="spellStart"/>
+            <w:r>
+              <w:rPr>
+                <w:rFonts w:ascii="Tahoma" w:hAnsi="Tahoma" w:cs="Tahoma"/>
+                <w:i/>
+                <w:iCs/>
+                <w:color w:val="000000" w:themeColor="text1"/>
+                <w:sz w:val="16"/>
+                <w:szCs w:val="16"/>
+              </w:rPr>
+              <w:t>na</w:t>
+            </w:r>
+            <w:proofErr w:type="spellEnd"/>
+            <w:r>
+              <w:rPr>
+                <w:rFonts w:ascii="Tahoma" w:hAnsi="Tahoma" w:cs="Tahoma"/>
+                <w:i/>
+                <w:iCs/>
+                <w:color w:val="000000" w:themeColor="text1"/>
+                <w:sz w:val="16"/>
+                <w:szCs w:val="16"/>
+              </w:rPr>
+              <w:t xml:space="preserve"> may </w:t>
+            </w:r>
+            <w:proofErr w:type="spellStart"/>
+            <w:r>
+              <w:rPr>
+                <w:rFonts w:ascii="Tahoma" w:hAnsi="Tahoma" w:cs="Tahoma"/>
+                <w:i/>
+                <w:iCs/>
+                <w:color w:val="000000" w:themeColor="text1"/>
+                <w:sz w:val="16"/>
+                <w:szCs w:val="16"/>
+              </w:rPr>
+              <w:t>libreng</w:t>
+            </w:r>
+            <w:proofErr w:type="spellEnd"/>
+            <w:r>
+              <w:rPr>
+                <w:rFonts w:ascii="Tahoma" w:hAnsi="Tahoma" w:cs="Tahoma"/>
+                <w:i/>
+                <w:iCs/>
+                <w:color w:val="000000" w:themeColor="text1"/>
+                <w:sz w:val="16"/>
+                <w:szCs w:val="16"/>
+              </w:rPr>
+              <w:t xml:space="preserve"> prophylaxis? </w:t>
             </w:r>
             <w:r>
               <w:rPr>
@@ -24807,7 +25772,27 @@
                 <w:sz w:val="16"/>
                 <w:szCs w:val="16"/>
               </w:rPr>
-              <w:t>s, if Yes list kung saan: _________________</w:t>
+              <w:t xml:space="preserve">s, if Yes list kung </w:t>
+            </w:r>
+            <w:proofErr w:type="spellStart"/>
+            <w:r>
+              <w:rPr>
+                <w:rFonts w:ascii="Tahoma" w:eastAsia="Tahoma" w:hAnsi="Tahoma" w:cs="Tahoma"/>
+                <w:color w:val="000000" w:themeColor="text1"/>
+                <w:sz w:val="16"/>
+                <w:szCs w:val="16"/>
+              </w:rPr>
+              <w:t>saan</w:t>
+            </w:r>
+            <w:proofErr w:type="spellEnd"/>
+            <w:r>
+              <w:rPr>
+                <w:rFonts w:ascii="Tahoma" w:eastAsia="Tahoma" w:hAnsi="Tahoma" w:cs="Tahoma"/>
+                <w:color w:val="000000" w:themeColor="text1"/>
+                <w:sz w:val="16"/>
+                <w:szCs w:val="16"/>
+              </w:rPr>
+              <w:t>: _________________</w:t>
             </w:r>
             <w:proofErr w:type="gramStart"/>
             <w:r>
@@ -24889,7 +25874,175 @@
                 <w:sz w:val="16"/>
                 <w:szCs w:val="16"/>
               </w:rPr>
-              <w:t>Kung may libreng prophylaxis na ino-offer, tatanggapin mo ba ito?</w:t>
+              <w:t xml:space="preserve">Kung may </w:t>
+            </w:r>
+            <w:proofErr w:type="spellStart"/>
+            <w:r>
+              <w:rPr>
+                <w:rFonts w:ascii="Tahoma" w:hAnsi="Tahoma" w:cs="Tahoma"/>
+                <w:i/>
+                <w:iCs/>
+                <w:color w:val="000000" w:themeColor="text1"/>
+                <w:sz w:val="16"/>
+                <w:szCs w:val="16"/>
+              </w:rPr>
+              <w:t>libreng</w:t>
+            </w:r>
+            <w:proofErr w:type="spellEnd"/>
+            <w:r>
+              <w:rPr>
+                <w:rFonts w:ascii="Tahoma" w:hAnsi="Tahoma" w:cs="Tahoma"/>
+                <w:i/>
+                <w:iCs/>
+                <w:color w:val="000000" w:themeColor="text1"/>
+                <w:sz w:val="16"/>
+                <w:szCs w:val="16"/>
+              </w:rPr>
+              <w:t xml:space="preserve"> prophylaxis </w:t>
+            </w:r>
+            <w:proofErr w:type="spellStart"/>
+            <w:r>
+              <w:rPr>
+                <w:rFonts w:ascii="Tahoma" w:hAnsi="Tahoma" w:cs="Tahoma"/>
+                <w:i/>
+                <w:iCs/>
+                <w:color w:val="000000" w:themeColor="text1"/>
+                <w:sz w:val="16"/>
+                <w:szCs w:val="16"/>
+              </w:rPr>
+              <w:t>na</w:t>
+            </w:r>
+            <w:proofErr w:type="spellEnd"/>
+            <w:r>
+              <w:rPr>
+                <w:rFonts w:ascii="Tahoma" w:hAnsi="Tahoma" w:cs="Tahoma"/>
+                <w:i/>
+                <w:iCs/>
+                <w:color w:val="000000" w:themeColor="text1"/>
+                <w:sz w:val="16"/>
+                <w:szCs w:val="16"/>
+              </w:rPr>
+              <w:t xml:space="preserve"> </w:t>
+            </w:r>
+            <w:proofErr w:type="spellStart"/>
+            <w:r>
+              <w:rPr>
+                <w:rFonts w:ascii="Tahoma" w:hAnsi="Tahoma" w:cs="Tahoma"/>
+                <w:i/>
+                <w:iCs/>
+                <w:color w:val="000000" w:themeColor="text1"/>
+                <w:sz w:val="16"/>
+                <w:szCs w:val="16"/>
+              </w:rPr>
+              <w:t>ino</w:t>
+            </w:r>
+            <w:proofErr w:type="spellEnd"/>
+            <w:r>
+              <w:rPr>
+                <w:rFonts w:ascii="Tahoma" w:hAnsi="Tahoma" w:cs="Tahoma"/>
+                <w:i/>
+                <w:iCs/>
+                <w:color w:val="000000" w:themeColor="text1"/>
+                <w:sz w:val="16"/>
+                <w:szCs w:val="16"/>
+              </w:rPr>
+              <w:t xml:space="preserve">-offer, </w:t>
+            </w:r>
+            <w:proofErr w:type="spellStart"/>
+            <w:r>
+              <w:rPr>
+                <w:rFonts w:ascii="Tahoma" w:hAnsi="Tahoma" w:cs="Tahoma"/>
+                <w:i/>
+                <w:iCs/>
+                <w:color w:val="000000" w:themeColor="text1"/>
+                <w:sz w:val="16"/>
+                <w:szCs w:val="16"/>
+              </w:rPr>
+              <w:t>tatanggapin</w:t>
+            </w:r>
+            <w:proofErr w:type="spellEnd"/>
+            <w:r>
+              <w:rPr>
+                <w:rFonts w:ascii="Tahoma" w:hAnsi="Tahoma" w:cs="Tahoma"/>
+                <w:i/>
+                <w:iCs/>
+                <w:color w:val="000000" w:themeColor="text1"/>
+                <w:sz w:val="16"/>
+                <w:szCs w:val="16"/>
+              </w:rPr>
+              <w:t xml:space="preserve"> </w:t>
+            </w:r>
+            <w:proofErr w:type="spellStart"/>
+            <w:r>
+              <w:rPr>
+                <w:rFonts w:ascii="Tahoma" w:hAnsi="Tahoma" w:cs="Tahoma"/>
+                <w:i/>
+                <w:iCs/>
+                <w:color w:val="000000" w:themeColor="text1"/>
+                <w:sz w:val="16"/>
+                <w:szCs w:val="16"/>
+              </w:rPr>
+              <w:t>mo</w:t>
+            </w:r>
+            <w:proofErr w:type="spellEnd"/>
+            <w:r>
+              <w:rPr>
+                <w:rFonts w:ascii="Tahoma" w:hAnsi="Tahoma" w:cs="Tahoma"/>
+                <w:i/>
+                <w:iCs/>
+                <w:color w:val="000000" w:themeColor="text1"/>
+                <w:sz w:val="16"/>
+                <w:szCs w:val="16"/>
+              </w:rPr>
+              <w:t xml:space="preserve"> </w:t>
+            </w:r>
+            <w:proofErr w:type="spellStart"/>
+            <w:r>
+              <w:rPr>
+                <w:rFonts w:ascii="Tahoma" w:hAnsi="Tahoma" w:cs="Tahoma"/>
+                <w:i/>
+                <w:iCs/>
+                <w:color w:val="000000" w:themeColor="text1"/>
+                <w:sz w:val="16"/>
+                <w:szCs w:val="16"/>
+              </w:rPr>
+              <w:t>ba</w:t>
+            </w:r>
+            <w:proofErr w:type="spellEnd"/>
+            <w:r>
+              <w:rPr>
+                <w:rFonts w:ascii="Tahoma" w:hAnsi="Tahoma" w:cs="Tahoma"/>
+                <w:i/>
+                <w:iCs/>
+                <w:color w:val="000000" w:themeColor="text1"/>
+                <w:sz w:val="16"/>
+                <w:szCs w:val="16"/>
+              </w:rPr>
+              <w:t xml:space="preserve"> </w:t>
+            </w:r>
+            <w:proofErr w:type="spellStart"/>
+            <w:r>
+              <w:rPr>
+                <w:rFonts w:ascii="Tahoma" w:hAnsi="Tahoma" w:cs="Tahoma"/>
+                <w:i/>
+                <w:iCs/>
+                <w:color w:val="000000" w:themeColor="text1"/>
+                <w:sz w:val="16"/>
+                <w:szCs w:val="16"/>
+              </w:rPr>
+              <w:t>ito</w:t>
+            </w:r>
+            <w:proofErr w:type="spellEnd"/>
+            <w:r>
+              <w:rPr>
+                <w:rFonts w:ascii="Tahoma" w:hAnsi="Tahoma" w:cs="Tahoma"/>
+                <w:i/>
+                <w:iCs/>
+                <w:color w:val="000000" w:themeColor="text1"/>
+                <w:sz w:val="16"/>
+                <w:szCs w:val="16"/>
+              </w:rPr>
+              <w:t>?</w:t>
             </w:r>
             <w:r>
               <w:rPr>
@@ -24976,21 +26129,6 @@
           <w:szCs w:val="15"/>
         </w:rPr>
       </w:pPr>
-    </w:p>
-    <w:p>
-      <w:pPr>
-        <w:rPr>
-          <w:sz w:val="15"/>
-          <w:szCs w:val="15"/>
-        </w:rPr>
-      </w:pPr>
-      <w:r>
-        <w:rPr>
-          <w:sz w:val="15"/>
-          <w:szCs w:val="15"/>
-        </w:rPr>
-        <w:br w:type="page"/>
-      </w:r>
     </w:p>
     <w:tbl>
       <w:tblPr>
@@ -25028,15 +26166,6 @@
                 <w:szCs w:val="15"/>
               </w:rPr>
             </w:pPr>
-            <w:r>
-              <w:rPr>
-                <w:rFonts w:ascii="Tahoma" w:hAnsi="Tahoma" w:cs="Tahoma"/>
-                <w:sz w:val="15"/>
-                <w:szCs w:val="15"/>
-              </w:rPr>
-              <w:lastRenderedPageBreak/>
-              <w:br w:type="page"/>
-            </w:r>
             <w:r>
               <w:rPr>
                 <w:rFonts w:ascii="Tahoma" w:eastAsia="Tahoma" w:hAnsi="Tahoma" w:cs="Tahoma"/>
@@ -27181,6 +28310,10 @@
 
 <file path=word/footer1.xml><?xml version="1.0" encoding="utf-8"?>
 <w:ftr xmlns:wpc="http://schemas.microsoft.com/office/word/2010/wordprocessingCanvas" xmlns:cx="http://schemas.microsoft.com/office/drawing/2014/chartex" xmlns:cx1="http://schemas.microsoft.com/office/drawing/2015/9/8/chartex" xmlns:cx2="http://schemas.microsoft.com/office/drawing/2015/10/21/chartex" xmlns:cx3="http://schemas.microsoft.com/office/drawing/2016/5/9/chartex" xmlns:cx4="http://schemas.microsoft.com/office/drawing/2016/5/10/chartex" xmlns:cx5="http://schemas.microsoft.com/office/drawing/2016/5/11/chartex" xmlns:cx6="http://schemas.microsoft.com/office/drawing/2016/5/12/chartex" xmlns:cx7="http://schemas.microsoft.com/office/drawing/2016/5/13/chartex" xmlns:cx8="http://schemas.microsoft.com/office/drawing/2016/5/14/chartex" xmlns:mc="http://schemas.openxmlformats.org/markup-compatibility/2006" xmlns:aink="http://schemas.microsoft.com/office/drawing/2016/ink" xmlns:am3d="http://schemas.microsoft.com/office/drawing/2017/model3d" xmlns:o="urn:schemas-microsoft-com:office:office" xmlns:oel="http://schemas.microsoft.com/office/2019/extlst" xmlns:r="http://schemas.openxmlformats.org/officeDocument/2006/relationships" xmlns:m="http://schemas.openxmlformats.org/officeDocument/2006/math" xmlns:v="urn:schemas-microsoft-com:vml" xmlns:wp14="http://schemas.microsoft.com/office/word/2010/wordprocessingDrawing" xmlns:wp="http://schemas.openxmlformats.org/drawingml/2006/wordprocessingDrawing" xmlns:w10="urn:schemas-microsoft-com:office:word" xmlns:w="http://schemas.openxmlformats.org/wordprocessingml/2006/main" xmlns:w14="http://schemas.microsoft.com/office/word/2010/wordml" xmlns:w15="http://schemas.microsoft.com/office/word/2012/wordml" xmlns:w16cex="http://schemas.microsoft.com/office/word/2018/wordml/cex" xmlns:w16cid="http://schemas.microsoft.com/office/word/2016/wordml/cid" xmlns:w16="http://schemas.microsoft.com/office/word/2018/wordml" xmlns:w16du="http://schemas.microsoft.com/office/word/2023/wordml/word16du" xmlns:w16sdtdh="http://schemas.microsoft.com/office/word/2020/wordml/sdtdatahash" xmlns:w16sdtfl="http://schemas.microsoft.com/office/word/2024/wordml/sdtformatlock" xmlns:w16se="http://schemas.microsoft.com/office/word/2015/wordml/symex" xmlns:wpg="http://schemas.microsoft.com/office/word/2010/wordprocessingGroup" xmlns:wpi="http://schemas.microsoft.com/office/word/2010/wordprocessingInk" xmlns:wne="http://schemas.microsoft.com/office/word/2006/wordml" xmlns:wps="http://schemas.microsoft.com/office/word/2010/wordprocessingShape" mc:Ignorable="w14 w15 w16se w16cid w16 w16cex w16sdtdh w16sdtfl w16du wp14">
+  <w:bookmarkStart w:id="1" w:name="_Hlk195262327"/>
+  <w:bookmarkStart w:id="2" w:name="_Hlk195262328"/>
+  <w:bookmarkStart w:id="3" w:name="_Hlk195262479"/>
+  <w:bookmarkStart w:id="4" w:name="_Hlk195262480"/>
   <w:p>
     <w:pPr>
       <w:pStyle w:val="Footer"/>
@@ -27194,10 +28327,6 @@
         <w:szCs w:val="20"/>
       </w:rPr>
     </w:pPr>
-    <w:bookmarkStart w:id="1" w:name="_Hlk195262327"/>
-    <w:bookmarkStart w:id="2" w:name="_Hlk195262328"/>
-    <w:bookmarkStart w:id="3" w:name="_Hlk195262479"/>
-    <w:bookmarkStart w:id="4" w:name="_Hlk195262480"/>
     <w:r>
       <w:rPr>
         <w:noProof/>
@@ -27264,7 +28393,111 @@
                               <w:szCs w:val="28"/>
                               <w:lang w:val="en-US"/>
                             </w:rPr>
-                            <w:t>“Matatag, Mapagkakatiwalaan, at Maaasahang Pamunuan”</w:t>
+                            <w:t>“</w:t>
+                          </w:r>
+                          <w:proofErr w:type="spellStart"/>
+                          <w:r>
+                            <w:rPr>
+                              <w:b/>
+                              <w:bCs/>
+                              <w:i/>
+                              <w:iCs/>
+                              <w:sz w:val="28"/>
+                              <w:szCs w:val="28"/>
+                              <w:lang w:val="en-US"/>
+                            </w:rPr>
+                            <w:t>Matatag</w:t>
+                          </w:r>
+                          <w:proofErr w:type="spellEnd"/>
+                          <w:r>
+                            <w:rPr>
+                              <w:b/>
+                              <w:bCs/>
+                              <w:i/>
+                              <w:iCs/>
+                              <w:sz w:val="28"/>
+                              <w:szCs w:val="28"/>
+                              <w:lang w:val="en-US"/>
+                            </w:rPr>
+                            <w:t xml:space="preserve">, </w:t>
+                          </w:r>
+                          <w:proofErr w:type="spellStart"/>
+                          <w:r>
+                            <w:rPr>
+                              <w:b/>
+                              <w:bCs/>
+                              <w:i/>
+                              <w:iCs/>
+                              <w:sz w:val="28"/>
+                              <w:szCs w:val="28"/>
+                              <w:lang w:val="en-US"/>
+                            </w:rPr>
+                            <w:t>Mapagkakatiwalaan</w:t>
+                          </w:r>
+                          <w:proofErr w:type="spellEnd"/>
+                          <w:r>
+                            <w:rPr>
+                              <w:b/>
+                              <w:bCs/>
+                              <w:i/>
+                              <w:iCs/>
+                              <w:sz w:val="28"/>
+                              <w:szCs w:val="28"/>
+                              <w:lang w:val="en-US"/>
+                            </w:rPr>
+                            <w:t xml:space="preserve">, at </w:t>
+                          </w:r>
+                          <w:proofErr w:type="spellStart"/>
+                          <w:r>
+                            <w:rPr>
+                              <w:b/>
+                              <w:bCs/>
+                              <w:i/>
+                              <w:iCs/>
+                              <w:sz w:val="28"/>
+                              <w:szCs w:val="28"/>
+                              <w:lang w:val="en-US"/>
+                            </w:rPr>
+                            <w:t>Maaasahang</w:t>
+                          </w:r>
+                          <w:proofErr w:type="spellEnd"/>
+                          <w:r>
+                            <w:rPr>
+                              <w:b/>
+                              <w:bCs/>
+                              <w:i/>
+                              <w:iCs/>
+                              <w:sz w:val="28"/>
+                              <w:szCs w:val="28"/>
+                              <w:lang w:val="en-US"/>
+                            </w:rPr>
+                            <w:t xml:space="preserve"> </w:t>
+                          </w:r>
+                          <w:proofErr w:type="spellStart"/>
+                          <w:r>
+                            <w:rPr>
+                              <w:b/>
+                              <w:bCs/>
+                              <w:i/>
+                              <w:iCs/>
+                              <w:sz w:val="28"/>
+                              <w:szCs w:val="28"/>
+                              <w:lang w:val="en-US"/>
+                            </w:rPr>
+                            <w:t>Pamunuan</w:t>
+                          </w:r>
+                          <w:proofErr w:type="spellEnd"/>
+                          <w:r>
+                            <w:rPr>
+                              <w:b/>
+                              <w:bCs/>
+                              <w:i/>
+                              <w:iCs/>
+                              <w:sz w:val="28"/>
+                              <w:szCs w:val="28"/>
+                              <w:lang w:val="en-US"/>
+                            </w:rPr>
+                            <w:t>”</w:t>
                           </w:r>
                         </w:p>
                       </w:txbxContent>

</xml_diff>